<commit_message>
Promesa venta 9844: entrega a 5 dias del desembolso; arras se devuelven menos $2M por gastos/lucro cesante
Co-Authored-By: Claude Opus 4.8 <noreply@anthropic.com>
Claude-Session: https://claude.ai/code/session_01V3nTS2cxs4zGL1pJrFeNth
</commit_message>
<xml_diff>
--- a/flipping-01-el-tirol-3-apto-9844/Promesa-Venta-9844-John-Mario-DEFINITIVO.docx
+++ b/flipping-01-el-tirol-3-apto-9844/Promesa-Venta-9844-John-Mario-DEFINITIVO.docx
@@ -589,21 +589,22 @@
         <w:t>se resolverá</w:t>
       </w:r>
       <w:r>
-        <w:t xml:space="preserve"> y LA PROMITENTE VENDEDORA </w:t>
-      </w:r>
-      <w:r>
-        <w:rPr>
-          <w:b/>
-        </w:rPr>
-        <w:t>restituirá las arras</w:t>
-      </w:r>
-      <w:r>
-        <w:t>, sin</w:t>
+        <w:t xml:space="preserve"> y LA PROMITENTE VENDEDORA **restituirá las arras,</w:t>
       </w:r>
     </w:p>
     <w:p>
       <w:r>
-        <w:t xml:space="preserve">  lugar a cláusula penal ni a indemnización.</w:t>
+        <w:t xml:space="preserve">  descontando la suma de DOS MILLONES DE PESOS ($2.000.000)** por concepto de gastos</w:t>
+      </w:r>
+    </w:p>
+    <w:p>
+      <w:r>
+        <w:t xml:space="preserve">  y lucro cesante por el tiempo que el inmueble estuvo fuera del mercado, sin lugar a</w:t>
+      </w:r>
+    </w:p>
+    <w:p>
+      <w:r>
+        <w:t xml:space="preserve">  cláusula penal ni a otra indemnización.</w:t>
       </w:r>
     </w:p>
     <w:p>
@@ -823,32 +824,12 @@
     </w:p>
     <w:p>
       <w:r>
-        <w:t>paz y salvo por servicios públicos, administración y predial, se realizará el día</w:t>
+        <w:t>paz y salvo por servicios públicos, administración y predial, se realizará **dentro de</w:t>
       </w:r>
     </w:p>
     <w:p>
       <w:r>
-        <w:rPr>
-          <w:b/>
-        </w:rPr>
-        <w:t>[DD/MM/AAAA]</w:t>
-      </w:r>
-      <w:r>
-        <w:t xml:space="preserve"> o dentro de los </w:t>
-      </w:r>
-      <w:r>
-        <w:rPr>
-          <w:b/>
-        </w:rPr>
-        <w:t>[Número]</w:t>
-      </w:r>
-      <w:r>
-        <w:t xml:space="preserve"> días siguientes al desembolso efectivo</w:t>
-      </w:r>
-    </w:p>
-    <w:p>
-      <w:r>
-        <w:t>del crédito por parte del FNA.</w:t>
+        <w:t>los cinco (5) días siguientes al desembolso efectivo del crédito** por parte del FNA.</w:t>
       </w:r>
     </w:p>
     <w:p>

</xml_diff>

<commit_message>
Promesa venta 9844: quita clausula penal; ajusta referencia en condicion FNA (perdida de arras por culpa del comprador) y renumera
Co-Authored-By: Claude Opus 4.8 <noreply@anthropic.com>
Claude-Session: https://claude.ai/code/session_01V3nTS2cxs4zGL1pJrFeNth
</commit_message>
<xml_diff>
--- a/flipping-01-el-tirol-3-apto-9844/Promesa-Venta-9844-John-Mario-DEFINITIVO.docx
+++ b/flipping-01-el-tirol-3-apto-9844/Promesa-Venta-9844-John-Mario-DEFINITIVO.docx
@@ -626,18 +626,12 @@
     </w:p>
     <w:p>
       <w:r>
-        <w:t xml:space="preserve">  COMPRADOR (no aportar documentos, desistir, etc.), se aplicará la </w:t>
-      </w:r>
-      <w:r>
-        <w:rPr>
-          <w:b/>
-        </w:rPr>
-        <w:t>cláusula penal</w:t>
+        <w:t xml:space="preserve">  COMPRADOR (no aportar documentos, desistir, etc.), **EL PROMITENTE COMPRADOR</w:t>
       </w:r>
     </w:p>
     <w:p>
       <w:r>
-        <w:t xml:space="preserve">  (cláusula DÉCIMA).</w:t>
+        <w:t xml:space="preserve">  perderá las arras entregadas** a favor de LA PROMITENTE VENDEDORA.</w:t>
       </w:r>
     </w:p>
     <w:p>
@@ -920,42 +914,7 @@
         <w:rPr>
           <w:b/>
         </w:rPr>
-        <w:t>CLÁUSULA DÉCIMA. – CLÁUSULA PENAL.</w:t>
-      </w:r>
-      <w:r>
-        <w:t xml:space="preserve"> Se establece como pena, a favor de la parte</w:t>
-      </w:r>
-    </w:p>
-    <w:p>
-      <w:r>
-        <w:t xml:space="preserve">cumplida o que se allane a cumplir, una suma equivalente al </w:t>
-      </w:r>
-      <w:r>
-        <w:rPr>
-          <w:b/>
-        </w:rPr>
-        <w:t>[10% / 15%]</w:t>
-      </w:r>
-      <w:r>
-        <w:t xml:space="preserve"> del valor</w:t>
-      </w:r>
-    </w:p>
-    <w:p>
-      <w:r>
-        <w:t>total de la venta, exigible por vía ejecutiva sin necesidad de requerimiento ni</w:t>
-      </w:r>
-    </w:p>
-    <w:p>
-      <w:r>
-        <w:t>constitución en mora, a los que las partes renuncian.</w:t>
-      </w:r>
-    </w:p>
-    <w:p>
-      <w:r>
-        <w:rPr>
-          <w:b/>
-        </w:rPr>
-        <w:t>CLÁUSULA DÉCIMA PRIMERA. – NOTIFICACIONES Y DIRECCIONES.</w:t>
+        <w:t>CLÁUSULA DÉCIMA. – NOTIFICACIONES Y DIRECCIONES.</w:t>
       </w:r>
     </w:p>
     <w:p>

</xml_diff>